<commit_message>
Testversion: Suche Stufe 1 (Entwurf Hub-Seiten, Mariann Stegmaier)
Trefferliste direkt unter den Knoepfen, Statuszeile und Rahmen nach der
Suche, Begriff in den Kacheln, Kopieren bei Portalen, x im Suchfeld,
Kennzeichen fest rechts, Lizenz grau, Leiste Art der Quelle umbrechend.

Co-Authored-By: Claude Opus 5.5 <noreply@anthropic.com>
</commit_message>
<xml_diff>
--- a/adipositas/download/studien-aktuell.docx
+++ b/adipositas/download/studien-aktuell.docx
@@ -62,7 +62,7 @@
           <w:color w:val="666666"/>
           <w:sz w:val="18"/>
         </w:rPr>
-        <w:t>Stand: 05.10.2026  |  6 Studien  |  adipositas.m-vf.de</w:t>
+        <w:t>Stand: 23.10.2026  |  6 Studien  |  adipositas.m-vf.de</w:t>
       </w:r>
     </w:p>
     <w:p>
@@ -70,7 +70,7 @@
         <w:pStyle w:val="Heading1"/>
       </w:pPr>
       <w:r>
-        <w:t>Aufgenommen am 05.10.2026</w:t>
+        <w:t>Aufgenommen am 23.10.2026</w:t>
       </w:r>
     </w:p>
     <w:p>
@@ -78,7 +78,7 @@
         <w:pStyle w:val="Heading2"/>
       </w:pPr>
       <w:r>
-        <w:t>BMI-Anforderungen für Organtransplantation in USA: Drei Staaten mit Ausschlusskriterium, 32 unklar</w:t>
+        <w:t>Schulische Adipositasprävention in China: Verbesserte nur 26,6 % der übergewichtigen Kinder</w:t>
       </w:r>
     </w:p>
     <w:p>
@@ -88,12 +88,12 @@
           <w:color w:val="666666"/>
           <w:sz w:val="18"/>
         </w:rPr>
-        <w:t>Klitenic SB et al.  ·  Clin Transplant  ·  Okt. 2026  ·  PMID 42829945</w:t>
+        <w:t>Chen JF et al.  ·  Zhonghua Liu Xing Bing Xue Za Zhi  ·  10.10.2026  ·  PMID 42907187</w:t>
       </w:r>
     </w:p>
     <w:p>
       <w:r>
-        <w:t>Ein Review aller 50 US-Bundesstaaten identifizierte, ob Medicaid explizite BMI-Grenzen für die Kostenübernahme von Herz-, Lungen-, Leber-, Nieren-, Pankreas- oder Dünndarmtransplantationen haben.</w:t>
+        <w:t>Longitudinale Kohortenstudie bei 91.538 Grundschülern zum Verlauf der Übergewichtsquote unter bestehenden Präventionsmaßnahmen in städtischen und ländlichen Schulen (2022–2024).</w:t>
       </w:r>
     </w:p>
     <w:p>
@@ -104,7 +104,7 @@
         <w:t xml:space="preserve">Ergebnis: </w:t>
       </w:r>
       <w:r>
-        <w:t>Nur drei Staaten (Hawaii, Iowa, North Carolina) hatten restriktive BMI-Vorgaben – allein für Herz, Lunge und kombinierte Transplantationen. 32 Staaten und DC hatten teils restriktive Richtlinien; 15 hatten keine. Kriterien stammten meist von Managed-Care-Organisationen, nicht von staatlicher Regulierung. Keine Beschränkung für Nieren-, Leber- oder Pankreas-Transplantation.</w:t>
+        <w:t>Übergewichtsquote und Adipositasquote 2024: 14,59 % bzw. 14,34 % (beide gestiegen gegenüber 2022, p&lt;0,001). Von den übergewichtigen Kindern wurden nur 26,56 % normal gewichtig, nur 2,66 % der adipösen. Neue Fälle: 8,62 % Übergewicht, 1,08 % Adipositas. Landkinder hatten 1,25-faches Übergewicht- und 1,34-faches Adipositasrisiko vs. Stadt.</w:t>
       </w:r>
     </w:p>
     <w:p>
@@ -119,7 +119,7 @@
         <w:rPr>
           <w:sz w:val="19"/>
         </w:rPr>
-        <w:t>USA, Medicaid-System nicht mit deutschem SGB V vergleichbar; Erstattungsfragen jedoch relevant</w:t>
+        <w:t>China – zeigt, dass bestehende Schulprogramme unwirksam sind</w:t>
       </w:r>
     </w:p>
     <w:p>
@@ -128,7 +128,7 @@
           <w:color w:val="5A7D3A"/>
           <w:sz w:val="18"/>
         </w:rPr>
-        <w:t>https://pubmed.ncbi.nlm.nih.gov/42829945/</w:t>
+        <w:t>https://pubmed.ncbi.nlm.nih.gov/42907187/</w:t>
       </w:r>
     </w:p>
     <w:p>
@@ -136,7 +136,7 @@
         <w:pStyle w:val="Heading2"/>
       </w:pPr>
       <w:r>
-        <w:t>GLP-1-Rezeptoragonisten senken 90-Tage-Mortalität nach Sepsis um 19 % gegenüber SGLT2-Inhibitoren</w:t>
+        <w:t>Spaniens Adipositäsprävention: Nationale Umsetzung mit messbarem Erfolg</w:t>
       </w:r>
     </w:p>
     <w:p>
@@ -146,12 +146,12 @@
           <w:color w:val="666666"/>
           <w:sz w:val="18"/>
         </w:rPr>
-        <w:t>Liu HH et al.  ·  Drug Des Devel Ther  ·  29.09.2026  ·  PMID 42829714</w:t>
+        <w:t>Montes D et al.  ·  Rev Esp Salud Publica  ·  21.10.2026  ·  PMID 42904533</w:t>
       </w:r>
     </w:p>
     <w:p>
       <w:r>
-        <w:t>Eine retrospektive Kohortenanalyse von 11.969 Patienten pro Gruppe mit Typ-2-Diabetes, die vor Sepsisaufnahme entweder GLP-1-Rezeptoragonisten oder SGLT2-Inhibitoren erhielten, verglich klinische Ergebnisse.</w:t>
+        <w:t>Analyse der Umsetzung des WHO-Aktionsplans zur Adipositasbekämpfung in Spanien mit Fokus auf Governance, Koordination und Messbarkeit von Outcomes.</w:t>
       </w:r>
     </w:p>
     <w:p>
@@ -162,7 +162,7 @@
         <w:t xml:space="preserve">Ergebnis: </w:t>
       </w:r>
       <w:r>
-        <w:t>Unter GLP-1-RA-Exposition betrug die 90-Tage-Mortalität 48,6 pro 100 Personenjahre vs. 60,6 unter SGLT2i (Hazard Ratio 0,81; 95%-KI 0,75–0,88). Auch schwerwiegende kardiovaskuläre Ereignisse waren seltener (HR 0,77). Die Effekte waren bei Subgruppenanalysen konsistent, doch der E-Wert (1,6) und Baselineunterschiede deuten auf residuelle Verwirrung hin.</w:t>
+        <w:t>Der ALADINO-Studie zufolge sank der Anteil übergewichtiger Kinder (6–9 Jahre) zwischen 2019 und 2023 um 4,5 Prozentpunkte. Die Gesamtstrategie Spaniens mit Multisektoral-Governance und jährlichen Ministerkonferenzen ermöglichte es, internationale Ziele messbarer zu operationalisieren, deckte aber weiterhin erhebliche sozioökonomische Ungleichgewichte auf.</w:t>
       </w:r>
     </w:p>
     <w:p>
@@ -177,7 +177,7 @@
         <w:rPr>
           <w:sz w:val="19"/>
         </w:rPr>
-        <w:t>USA, TriNetX-Netzwerk; Aussage über Arzneimittelvorteil bei Sepsis ist systemübergreifend relevant, aber Kostenumdefinition in Deutschland andere</w:t>
+        <w:t>Spanien, vergleichbarer Wohlfahrtsstaat und Sozialversicherungssystem</w:t>
       </w:r>
     </w:p>
     <w:p>
@@ -186,7 +186,7 @@
           <w:color w:val="5A7D3A"/>
           <w:sz w:val="18"/>
         </w:rPr>
-        <w:t>https://pubmed.ncbi.nlm.nih.gov/42829714/</w:t>
+        <w:t>https://pubmed.ncbi.nlm.nih.gov/42904533/</w:t>
       </w:r>
     </w:p>
     <w:p>
@@ -194,7 +194,7 @@
         <w:pStyle w:val="Heading2"/>
       </w:pPr>
       <w:r>
-        <w:t>Nachtschichten bei Pflegekräften: 6,7-fach höheres Metabolisches-Syndrom-Risiko bei ≥4 Schichten/Monat</w:t>
+        <w:t>Bewegungsverordnung in der Primärversorgung: Spaniens Strukturansatz für Kinder</w:t>
       </w:r>
     </w:p>
     <w:p>
@@ -204,12 +204,12 @@
           <w:color w:val="666666"/>
           <w:sz w:val="18"/>
         </w:rPr>
-        <w:t>Yang Y et al.  ·  Front Public Health  ·  18.09.2026  ·  PMID 42827874</w:t>
+        <w:t>Giménez Alba IM et al.  ·  Rev Esp Salud Publica  ·  23.09.2026  ·  PMID 42904447</w:t>
       </w:r>
     </w:p>
     <w:p>
       <w:r>
-        <w:t>Eine Querschnittsstudie von 719 Gesundheitsbeschäftigten in China untersuchte, ob Nachtschichthäufigkeit das Metabolische Syndrom (MetS) über Stress und Schlafqualität vorhersagt.</w:t>
+        <w:t>Systematische Analyse von Spaniens Aktivitätsverschreibungs- und Gesundheitsvermittlungsprogrammen in der Primärversorgung mit Fokus auf Umsetzungsbarrieren und Chancen.</w:t>
       </w:r>
     </w:p>
     <w:p>
@@ -220,7 +220,7 @@
         <w:t xml:space="preserve">Ergebnis: </w:t>
       </w:r>
       <w:r>
-        <w:t>Von 719 Fachkräften hatten 124 (17,2 %) MetS. Bei ≥4 Nachtschichten pro Monat war die bereinigte Odds Ratio 6,65 (95%-KI 2,56–17,28) gegenüber 0 Schichten. Die indirekte Assoziation über beruflichen Stress betrug 27,7 % der Gesamtassoziation und war bei schlechterer Schlafqualität stärker. Dies deutet auf einen therapeutischen Ansatzpunkt hin.</w:t>
+        <w:t>16 der 17 autonomen Gemeinschaften führen Ernährungsberatung durch; 13 verschreiben oder empfehlen Aktivität. Nur 35,3 % haben Zugang zu Ernährungsfachkräften (davon nur 3 in der Primärversorgung). Trotz politischer Fortschritte bleibt die Umsetzung fragmentiert, besonders bei der Sicherstellung equitativer Ressourcenverteilung.</w:t>
       </w:r>
     </w:p>
     <w:p>
@@ -235,7 +235,7 @@
         <w:rPr>
           <w:sz w:val="19"/>
         </w:rPr>
-        <w:t>China, aber berufliche Arbeitsbedingungen in der Pflege sind systemübergreifend ähnlich</w:t>
+        <w:t>Spanien, DACH-Vergleichbarkeit bei tertiärer Prävention</w:t>
       </w:r>
     </w:p>
     <w:p>
@@ -244,7 +244,7 @@
           <w:color w:val="5A7D3A"/>
           <w:sz w:val="18"/>
         </w:rPr>
-        <w:t>https://pubmed.ncbi.nlm.nih.gov/42827874/</w:t>
+        <w:t>https://pubmed.ncbi.nlm.nih.gov/42904447/</w:t>
       </w:r>
     </w:p>
     <w:p>
@@ -252,7 +252,7 @@
         <w:pStyle w:val="Heading2"/>
       </w:pPr>
       <w:r>
-        <w:t>Polnische Adipositas-Dokumentation: vier ICD-10-Serien ergeben 4,7-fachen Unterschied</w:t>
+        <w:t>Kindervorsorge im Vergleich: Heterogene Standards bei Adipositaserfassung</w:t>
       </w:r>
     </w:p>
     <w:p>
@@ -262,12 +262,12 @@
           <w:color w:val="666666"/>
           <w:sz w:val="18"/>
         </w:rPr>
-        <w:t>Poboży M et al.  ·  Front Public Health  ·  18.09.2026  ·  PMID 42827465</w:t>
+        <w:t>Cabrera-León A et al.  ·  Rev Esp Salud Publica  ·  25.09.2026  ·  PMID 42904443</w:t>
       </w:r>
     </w:p>
     <w:p>
       <w:r>
-        <w:t>Eine Auditierung der polnischen National Health Fund-Daten von 2015–2025 zeigte, dass dieselbe ICD-10-E66-Kodierung je nach analytischer Definition vier völlig unterschiedliche administrative Trajektorien liefert, was Surveillance und Politikentscheidungen erschwert.</w:t>
+        <w:t>Querschnittserhebung zu Umsetzung und Dokumentation von Adipositásindikatoren in 17 spanischen Kindervorsorgeprogrammen der Primärversorgung.</w:t>
       </w:r>
     </w:p>
     <w:p>
@@ -278,7 +278,7 @@
         <w:t xml:space="preserve">Ergebnis: </w:t>
       </w:r>
       <w:r>
-        <w:t>Je nach Messmethode lagen 2025 zwischen 325.769 und 1.534.022 Personen mit Adipositas in den Datenreihen vor; die jährliche prozentuale Veränderung reichte von 10,5 bis 14,5 %. Während 2020 die Morbidität nur um 3,5 % absank, betrug der Rückgang bei Serien mit aktueller Aktivität −39,4 bis −44,3 %. Das zeigt, dass Wachstumsmeldungen nicht zwischen echter klinischer Zunahme und Veränderungen bei Erfassung, Zugang und Dokumentation unterscheiden können.</w:t>
+        <w:t>94,1 % der Gemeinschaften haben ein Programm; alle erfassen Gewicht und Länge elektronisch. Blutdruck wird nur in 58,8 %, Taillenumfang in 41,2 % gemessen. Sozioökonomische Determinanten dokumentieren nur 41,2 %, ein formales Protokoll nutzen nur 11,8 %. Es gibt kein gemeinsames Mindestdatensatz-Standard.</w:t>
       </w:r>
     </w:p>
     <w:p>
@@ -293,7 +293,7 @@
         <w:rPr>
           <w:sz w:val="19"/>
         </w:rPr>
-        <w:t>Polen, vergleichbares Versicherungssystem, direkt auf deutsche Kodierungsprobleme übertragbar</w:t>
+        <w:t>Spanien, zeigt Datenqualitätsgap europäischer Gesundheitssysteme</w:t>
       </w:r>
     </w:p>
     <w:p>
@@ -302,7 +302,7 @@
           <w:color w:val="5A7D3A"/>
           <w:sz w:val="18"/>
         </w:rPr>
-        <w:t>https://pubmed.ncbi.nlm.nih.gov/42827465/</w:t>
+        <w:t>https://pubmed.ncbi.nlm.nih.gov/42904443/</w:t>
       </w:r>
     </w:p>
     <w:p>
@@ -310,7 +310,7 @@
         <w:pStyle w:val="Heading2"/>
       </w:pPr>
       <w:r>
-        <w:t>TyG-Waist-Circumference vorhersagt kardiovaskuläre Ereignisse bei älteren Landbewohnern besser als TyG-Index allein</w:t>
+        <w:t>ALADINO 2023: Kinderadipositáts-Surveillance mit Repräsentativität</w:t>
       </w:r>
     </w:p>
     <w:p>
@@ -320,12 +320,12 @@
           <w:color w:val="666666"/>
           <w:sz w:val="18"/>
         </w:rPr>
-        <w:t>Xue Y et al.  ·  Front Endocrinol (Lausanne)  ·  30.09.2026  ·  PMID 42818901</w:t>
+        <w:t>Recuero Carretero C et al.  ·  Rev Esp Salud Publica  ·  19.10.2026  ·  PMID 42904441</w:t>
       </w:r>
     </w:p>
     <w:p>
       <w:r>
-        <w:t>Eine 6-jährige Kohortenanalyse von 4.169 älteren Landbewohnern (≥65 Jahre) in China verglich die prädiktive Kraft von Basis-, kumulative Exposition und jährliche Änderungen des Triglyzerid-Glukose-Index und seiner Ableitungen für kardiovaskuläre Ereignisse.</w:t>
+        <w:t>Methodische Beschreibung einer nationalen spanischen Querschnittstudie zur Adipositásprävalenz bei 6–9-jährigen Schulkindern (n=12.678) im Rahmen der WHO-COSI-Initiative.</w:t>
       </w:r>
     </w:p>
     <w:p>
@@ -336,7 +336,7 @@
         <w:t xml:space="preserve">Ergebnis: </w:t>
       </w:r>
       <w:r>
-        <w:t>822 kardiovaskuläre Ereignisse ereigneten sich während des Nachbeobachtung. Basis- und kumulative TyG-WC zeigten konsistent starke Assoziationen (p &lt; 0,001), mit kumulativen Maßen etwas stärker. Jährliche Mittelwertänderungen waren schwächer prädiktiv. TyG-WC zeigte über alle Nachbeobachtungszeiträume optimale prädiktive Performance; die Basis-Messung war so wertvoll wie die kumulative.</w:t>
+        <w:t>Erfassung anthropometrischer Daten und umfangreicher Lebensstil- sowie Soziodemografien bei direkter Messung in 296 Schulen. Die Studie bildet nationale und internationale Vergleichbarkeit ab und generiert hochwertige Daten mit Repräsentativität für die Ebenen national und international.</w:t>
       </w:r>
     </w:p>
     <w:p>
@@ -351,7 +351,7 @@
         <w:rPr>
           <w:sz w:val="19"/>
         </w:rPr>
-        <w:t>China, aber Screening-Methodik in ländlichen Primärversorgungssettings systemübergreifend anwendbar</w:t>
+        <w:t>Spanien, Referenzmethode für europäische Surveillance</w:t>
       </w:r>
     </w:p>
     <w:p>
@@ -360,7 +360,7 @@
           <w:color w:val="5A7D3A"/>
           <w:sz w:val="18"/>
         </w:rPr>
-        <w:t>https://pubmed.ncbi.nlm.nih.gov/42818901/</w:t>
+        <w:t>https://pubmed.ncbi.nlm.nih.gov/42904441/</w:t>
       </w:r>
     </w:p>
     <w:p>
@@ -368,7 +368,7 @@
         <w:pStyle w:val="Heading2"/>
       </w:pPr>
       <w:r>
-        <w:t>Höheres BMI verschlechtert Lymphknotentransfer-Ergebnis um 30–50 % bei Lymphödem</w:t>
+        <w:t>Multipla Therapie bei HFpEF: GLP-1 bringt mehr Gewichtsverlust als Kaloriendefizit allein</w:t>
       </w:r>
     </w:p>
     <w:p>
@@ -378,12 +378,12 @@
           <w:color w:val="666666"/>
           <w:sz w:val="18"/>
         </w:rPr>
-        <w:t>Kappos EA et al.  ·  J Plast Reconstr Aesthet Surg  ·  02.08.2026  ·  PMID 42594515</w:t>
+        <w:t>Prokopidis K et al.  ·  Curr Heart Fail Rep  ·  08.10.2026  ·  PMID 42848257</w:t>
       </w:r>
     </w:p>
     <w:p>
       <w:r>
-        <w:t>Eine prospektive multizentrische Kohortenstudie (2016–2025) aus der Schweiz und Deutschland prüfte, ob Geschlecht, Alter und BMI die Langzeitergebnisse von Lymphgefäßanastomose oder vaskulärisiertem Lymphknotentransfer beeinflussen.</w:t>
+        <w:t>Narrative Übersicht zu Lebensstil-, pharmakologischen und chirurgischen Interventionen zur Verbesserung von Muskelkraft, Körperkomposition und Funktionsfähigkeit bei HFpEF mit Sarkopenie und/oder Adipositas.</w:t>
       </w:r>
     </w:p>
     <w:p>
@@ -394,7 +394,7 @@
         <w:t xml:space="preserve">Ergebnis: </w:t>
       </w:r>
       <w:r>
-        <w:t>Bei Lymphödem der oberen Extremität war höheres BMI mit ungünstigerer Therapieantwort assoziiert (relatives Übergewichtsreduktionsmaß nach 12 und 18 Monaten signifikant erniedrigt). Männer mit Unterschenkelödem zeigten bessere Ansprechraten. Komplikationsraten unterschieden sich nicht. Präoperativer Gewichtsverlust könnte die Ergebnisse verbessern.</w:t>
+        <w:t>Konkurrentes Ausdauer- und Krafttraining verbessert aerobe Kapazität, Funktionsleistung und Lebensqualität. GLP-1-Arzneimittel führen zu größerem Gewichtsverlust und funktionellen Verbesserungen als SGLT2i allein. Kombination aus Widerstandstraining und adäquater Proteinzufuhr konserviert Muskelmasse während Gewichtsverlust besser als Kalorienrestriktion.</w:t>
       </w:r>
     </w:p>
     <w:p>
@@ -409,7 +409,7 @@
         <w:rPr>
           <w:sz w:val="19"/>
         </w:rPr>
-        <w:t>Schweiz und Deutschland, direkt übertragbar auf deutsches Gesundheitssystem</w:t>
+        <w:t>Deutschsprachige Autoren, UK, Skandinavien – Outcomes jenseits der Waage</w:t>
       </w:r>
     </w:p>
     <w:p>
@@ -418,7 +418,7 @@
           <w:color w:val="5A7D3A"/>
           <w:sz w:val="18"/>
         </w:rPr>
-        <w:t>https://pubmed.ncbi.nlm.nih.gov/42594515/</w:t>
+        <w:t>https://pubmed.ncbi.nlm.nih.gov/42848257/</w:t>
       </w:r>
     </w:p>
     <w:sectPr>

</xml_diff>

<commit_message>
Testversion: Stufe 3a - eine Spalte, Band Aktuell im Hub
Co-Authored-By: Claude Opus 5.5 <noreply@anthropic.com>
</commit_message>
<xml_diff>
--- a/adipositas/download/studien-aktuell.docx
+++ b/adipositas/download/studien-aktuell.docx
@@ -62,7 +62,7 @@
           <w:color w:val="666666"/>
           <w:sz w:val="18"/>
         </w:rPr>
-        <w:t>Stand: 23.10.2026  |  6 Studien  |  adipositas.m-vf.de</w:t>
+        <w:t>Stand: 24.10.2026  |  7 Studien  |  adipositas.m-vf.de</w:t>
       </w:r>
     </w:p>
     <w:p>
@@ -70,7 +70,7 @@
         <w:pStyle w:val="Heading1"/>
       </w:pPr>
       <w:r>
-        <w:t>Aufgenommen am 23.10.2026</w:t>
+        <w:t>Aufgenommen am 24.10.2026</w:t>
       </w:r>
     </w:p>
     <w:p>
@@ -78,7 +78,7 @@
         <w:pStyle w:val="Heading2"/>
       </w:pPr>
       <w:r>
-        <w:t>Schulische Adipositasprävention in China: Verbesserte nur 26,6 % der übergewichtigen Kinder</w:t>
+        <w:t>Neuseeländer: Adipositasmedikamente annehmbar, aber Sorgen um Kosten und Langzeitfolgen hemmen Nutzung</w:t>
       </w:r>
     </w:p>
     <w:p>
@@ -88,12 +88,12 @@
           <w:color w:val="666666"/>
           <w:sz w:val="18"/>
         </w:rPr>
-        <w:t>Chen JF et al.  ·  Zhonghua Liu Xing Bing Xue Za Zhi  ·  10.10.2026  ·  PMID 42907187</w:t>
+        <w:t>Taylor T et al.  ·  N Z Med J  ·  23.10.2026  ·  PMID 42912969</w:t>
       </w:r>
     </w:p>
     <w:p>
       <w:r>
-        <w:t>Longitudinale Kohortenstudie bei 91.538 Grundschülern zum Verlauf der Übergewichtsquote unter bestehenden Präventionsmaßnahmen in städtischen und ländlichen Schulen (2022–2024).</w:t>
+        <w:t>Querschnittsumfrage (n=216 Māori und Pacific-Erwachsene, 190 mit Übergewicht/Adipositas) zur Akzeptanz von Adipositasmedikamenten; multivariable logistische Regression und Mediationsanalyse.</w:t>
       </w:r>
     </w:p>
     <w:p>
@@ -104,7 +104,7 @@
         <w:t xml:space="preserve">Ergebnis: </w:t>
       </w:r>
       <w:r>
-        <w:t>Übergewichtsquote und Adipositasquote 2024: 14,59 % bzw. 14,34 % (beide gestiegen gegenüber 2022, p&lt;0,001). Von den übergewichtigen Kindern wurden nur 26,56 % normal gewichtig, nur 2,66 % der adipösen. Neue Fälle: 8,62 % Übergewicht, 1,08 % Adipositas. Landkinder hatten 1,25-faches Übergewicht- und 1,34-faches Adipositasrisiko vs. Stadt.</w:t>
+        <w:t>Mehrheit betrachtete Adipositasmedikamente als akzeptabel. Häufige Sorgen: Kosten, Wirksamkeit, nachträgliche Gewichtszunahme, unbekannte Körperauswirkungen, Langzeitabhängigkeit. Verabreichungsweg (oral vs. Injektion) war signifikanter Mediator ethnischer Unterschiede; Pacific-Teilnehmer höheres Bedenken als Māori. Geschlechtsmuster ähnlich, aber begrenzte männliche Teilnehmerzahl.</w:t>
       </w:r>
     </w:p>
     <w:p>
@@ -119,7 +119,7 @@
         <w:rPr>
           <w:sz w:val="19"/>
         </w:rPr>
-        <w:t>China – zeigt, dass bestehende Schulprogramme unwirksam sind</w:t>
+        <w:t>Neuseeland; ethnische Unterschiede in Arzneimittel-Akzeptanz, aber Kostenbarriere ist deutsches Problem (§34 SGB V).</w:t>
       </w:r>
     </w:p>
     <w:p>
@@ -128,7 +128,7 @@
           <w:color w:val="5A7D3A"/>
           <w:sz w:val="18"/>
         </w:rPr>
-        <w:t>https://pubmed.ncbi.nlm.nih.gov/42907187/</w:t>
+        <w:t>https://pubmed.ncbi.nlm.nih.gov/42912969/</w:t>
       </w:r>
     </w:p>
     <w:p>
@@ -136,7 +136,7 @@
         <w:pStyle w:val="Heading2"/>
       </w:pPr>
       <w:r>
-        <w:t>Spaniens Adipositäsprävention: Nationale Umsetzung mit messbarem Erfolg</w:t>
+        <w:t>Südasia: körperliche Inaktivität und Ernährung sind Hauptfaktoren für Adoleszenten-Adipositas</w:t>
       </w:r>
     </w:p>
     <w:p>
@@ -146,12 +146,12 @@
           <w:color w:val="666666"/>
           <w:sz w:val="18"/>
         </w:rPr>
-        <w:t>Montes D et al.  ·  Rev Esp Salud Publica  ·  21.10.2026  ·  PMID 42904533</w:t>
+        <w:t>Siddiquee T et al.  ·  Endocrinol Diabetes Metab  ·  Nov. 2026  ·  PMID 42912841</w:t>
       </w:r>
     </w:p>
     <w:p>
       <w:r>
-        <w:t>Analyse der Umsetzung des WHO-Aktionsplans zur Adipositasbekämpfung in Spanien mit Fokus auf Governance, Koordination und Messbarkeit von Outcomes.</w:t>
+        <w:t>Narrative Übersicht (13 Publikationen, 2015–August 2026) über Prävalenz und Faktoren der Adipositas bei 10–19-Jährigen in Südasia; separate Analyse primärer Studien (n=8) und systematischer Reviews (n=5).</w:t>
       </w:r>
     </w:p>
     <w:p>
@@ -162,7 +162,7 @@
         <w:t xml:space="preserve">Ergebnis: </w:t>
       </w:r>
       <w:r>
-        <w:t>Der ALADINO-Studie zufolge sank der Anteil übergewichtiger Kinder (6–9 Jahre) zwischen 2019 und 2023 um 4,5 Prozentpunkte. Die Gesamtstrategie Spaniens mit Multisektoral-Governance und jährlichen Ministerkonferenzen ermöglichte es, internationale Ziele messbarer zu operationalisieren, deckte aber weiterhin erhebliche sozioökonomische Ungleichgewichte auf.</w:t>
+        <w:t>Regionale Meta-Analysen: 12,4% Übergewicht, 6,6% Adipositas, 19,3% kombiniert. Konsistente Evidenz für körperliche Inaktivität, Sedentarismus und ungesunde Ernährung. Sozioökonomische Position, Urbanisierung, Geschlecht, Familie und Medienexposition zeigten heterogene, kontextabhängige Assoziationen. Schlaf, psychische Gesundheit, Nahrungsunsicherheit und Nachbarschaftsfaktoren waren unzureichend untersucht.</w:t>
       </w:r>
     </w:p>
     <w:p>
@@ -177,7 +177,7 @@
         <w:rPr>
           <w:sz w:val="19"/>
         </w:rPr>
-        <w:t>Spanien, vergleichbarer Wohlfahrtsstaat und Sozialversicherungssystem</w:t>
+        <w:t>Südasien; regionale Prävention erfordert lokal angepasste Ansätze, nicht universal übertragbar.</w:t>
       </w:r>
     </w:p>
     <w:p>
@@ -186,7 +186,7 @@
           <w:color w:val="5A7D3A"/>
           <w:sz w:val="18"/>
         </w:rPr>
-        <w:t>https://pubmed.ncbi.nlm.nih.gov/42904533/</w:t>
+        <w:t>https://pubmed.ncbi.nlm.nih.gov/42912841/</w:t>
       </w:r>
     </w:p>
     <w:p>
@@ -194,7 +194,7 @@
         <w:pStyle w:val="Heading2"/>
       </w:pPr>
       <w:r>
-        <w:t>Bewegungsverordnung in der Primärversorgung: Spaniens Strukturansatz für Kinder</w:t>
+        <w:t>Emotionsregulation in Familientherapie reduziert Gewichtsverlust-Rückgewinn bei Jugendlichen</w:t>
       </w:r>
     </w:p>
     <w:p>
@@ -204,12 +204,12 @@
           <w:color w:val="666666"/>
           <w:sz w:val="18"/>
         </w:rPr>
-        <w:t>Giménez Alba IM et al.  ·  Rev Esp Salud Publica  ·  23.09.2026  ·  PMID 42904447</w:t>
+        <w:t>Boutelle KN et al.  ·  JAMA Netw Open  ·  01.10.2026  ·  PMID 42911592</w:t>
       </w:r>
     </w:p>
     <w:p>
       <w:r>
-        <w:t>Systematische Analyse von Spaniens Aktivitätsverschreibungs- und Gesundheitsvermittlungsprogrammen in der Primärversorgung mit Fokus auf Umsetzungsbarrieren und Chancen.</w:t>
+        <w:t>Randomisierte Studie (n=166 Jugendliche, 13-16 Jahre) verglich Familientherapie mit zusätzlichem Emotionsregulations-Training gegen Standardtherapie; primärer Endpunkt war BMI-Änderung über 6 Monate mit 12-Monats-Nachverfolgung.</w:t>
       </w:r>
     </w:p>
     <w:p>
@@ -220,7 +220,7 @@
         <w:t xml:space="preserve">Ergebnis: </w:t>
       </w:r>
       <w:r>
-        <w:t>16 der 17 autonomen Gemeinschaften führen Ernährungsberatung durch; 13 verschreiben oder empfehlen Aktivität. Nur 35,3 % haben Zugang zu Ernährungsfachkräften (davon nur 3 in der Primärversorgung). Trotz politischer Fortschritte bleibt die Umsetzung fragmentiert, besonders bei der Sicherstellung equitativer Ressourcenverteilung.</w:t>
+        <w:t>Kein signifikanter Unterschied in Gewichtsverlust unter Behandlung (Differenz BMI-z-Score: 0,03). Nach 12 Monaten zeigte die Emotionsgruppe weniger Gewichtszunahme (−0,09 BMI-z-Score), 22% erreichten klinisch signifikante Gewichtsverluste versus 4% in Standardtherapie. Emotionales Essen war in der Emotionsgruppe niedriger.</w:t>
       </w:r>
     </w:p>
     <w:p>
@@ -235,7 +235,7 @@
         <w:rPr>
           <w:sz w:val="19"/>
         </w:rPr>
-        <w:t>Spanien, DACH-Vergleichbarkeit bei tertiärer Prävention</w:t>
+        <w:t>USA; Familientherapie-Modell ist mit deutschen ambulanten psychosomatischen Programmen vergleichbar.</w:t>
       </w:r>
     </w:p>
     <w:p>
@@ -244,7 +244,7 @@
           <w:color w:val="5A7D3A"/>
           <w:sz w:val="18"/>
         </w:rPr>
-        <w:t>https://pubmed.ncbi.nlm.nih.gov/42904447/</w:t>
+        <w:t>https://pubmed.ncbi.nlm.nih.gov/42911592/</w:t>
       </w:r>
     </w:p>
     <w:p>
@@ -252,7 +252,7 @@
         <w:pStyle w:val="Heading2"/>
       </w:pPr>
       <w:r>
-        <w:t>Kindervorsorge im Vergleich: Heterogene Standards bei Adipositaserfassung</w:t>
+        <w:t>Gestationszunahme außerhalb Normbereich erhöht schwere Mütter-Morbidität</w:t>
       </w:r>
     </w:p>
     <w:p>
@@ -262,12 +262,12 @@
           <w:color w:val="666666"/>
           <w:sz w:val="18"/>
         </w:rPr>
-        <w:t>Cabrera-León A et al.  ·  Rev Esp Salud Publica  ·  25.09.2026  ·  PMID 42904443</w:t>
+        <w:t>Khademioore S et al.  ·  JAMA Netw Open  ·  01.10.2026  ·  PMID 42911590</w:t>
       </w:r>
     </w:p>
     <w:p>
       <w:r>
-        <w:t>Querschnittserhebung zu Umsetzung und Dokumentation von Adipositásindikatoren in 17 spanischen Kindervorsorgeprogrammen der Primärversorgung.</w:t>
+        <w:t>Retrospektive Kohortenstudie (n=1.035.927 Singleton-Schwangerschaften) mit Geburts-Registerdaten (Ontario, Kanada, 2012-2022); Exposition: Gewichtszunahme nach IOM-Kategorien; Outcome: schwere Mütter-Morbidität (SMM).</w:t>
       </w:r>
     </w:p>
     <w:p>
@@ -278,7 +278,7 @@
         <w:t xml:space="preserve">Ergebnis: </w:t>
       </w:r>
       <w:r>
-        <w:t>94,1 % der Gemeinschaften haben ein Programm; alle erfassen Gewicht und Länge elektronisch. Blutdruck wird nur in 58,8 %, Taillenumfang in 41,2 % gemessen. Sozioökonomische Determinanten dokumentieren nur 41,2 %, ein formales Protokoll nutzen nur 11,8 %. Es gibt kein gemeinsames Mindestdatensatz-Standard.</w:t>
+        <w:t>SMM trat bei 14,59 pro 1000 Geburten auf. Excessive Gewichtszunahme war über alle BMI-Kategorien mit erhöhter SMM assoziiert (z.B. normal: adjustierte Ratenratio 1,24, 95%-KI 1,17–1,31). Inadäquate Zunahme erhöhte SMM bei Normalgewicht (aRR 1,13) und Übergewicht (aRR 1,19). Nicht-lineare Assoziationen je nach BMI-Kategorie.</w:t>
       </w:r>
     </w:p>
     <w:p>
@@ -293,7 +293,7 @@
         <w:rPr>
           <w:sz w:val="19"/>
         </w:rPr>
-        <w:t>Spanien, zeigt Datenqualitätsgap europäischer Gesundheitssysteme</w:t>
+        <w:t>Kanada, vergleichbares Gesundheitssystem; Geburts-Registerdaten übertragbar auf deutsches Setting.</w:t>
       </w:r>
     </w:p>
     <w:p>
@@ -302,7 +302,7 @@
           <w:color w:val="5A7D3A"/>
           <w:sz w:val="18"/>
         </w:rPr>
-        <w:t>https://pubmed.ncbi.nlm.nih.gov/42904443/</w:t>
+        <w:t>https://pubmed.ncbi.nlm.nih.gov/42911590/</w:t>
       </w:r>
     </w:p>
     <w:p>
@@ -310,7 +310,7 @@
         <w:pStyle w:val="Heading2"/>
       </w:pPr>
       <w:r>
-        <w:t>ALADINO 2023: Kinderadipositáts-Surveillance mit Repräsentativität</w:t>
+        <w:t>Arbeitsplatz-Lebensstileprogramm senkte metabolisches Syndrom trotz Implementierungs-Hürden</w:t>
       </w:r>
     </w:p>
     <w:p>
@@ -320,12 +320,12 @@
           <w:color w:val="666666"/>
           <w:sz w:val="18"/>
         </w:rPr>
-        <w:t>Recuero Carretero C et al.  ·  Rev Esp Salud Publica  ·  19.10.2026  ·  PMID 42904441</w:t>
+        <w:t>Bogale SK et al.  ·  Front Public Health  ·  07.10.2026  ·  PMID 42909154</w:t>
       </w:r>
     </w:p>
     <w:p>
       <w:r>
-        <w:t>Methodische Beschreibung einer nationalen spanischen Querschnittstudie zur Adipositásprävalenz bei 6–9-jährigen Schulkindern (n=12.678) im Rahmen der WHO-COSI-Initiative.</w:t>
+        <w:t>Mixed-Methods-Evaluation (n=226 Beschäftigte, Cluster-randomisiert) einer 9-Monatigen Arbeitsplatz-Intervention zur Metabolisches-Syndrom-Reduktion in Äthiopien; Implementierungstreue nach Programme Integrity Framework; Kontextfaktoren nach CFIR.</w:t>
       </w:r>
     </w:p>
     <w:p>
@@ -336,7 +336,7 @@
         <w:t xml:space="preserve">Ergebnis: </w:t>
       </w:r>
       <w:r>
-        <w:t>Erfassung anthropometrischer Daten und umfangreicher Lebensstil- sowie Soziodemografien bei direkter Messung in 296 Schulen. Die Studie bildet nationale und internationale Vergleichbarkeit ab und generiert hochwertige Daten mit Repräsentativität für die Ebenen national und international.</w:t>
+        <w:t>Hohe Implementierungstreue über Adhärenz, Exposition, Qualität und Teilnehmerresponse. Signifikante Metabolisches-Syndrom-Reduktion und Verhaltensverbesserungen in Interventionsgruppe. Implementierungs-Barrieren: unsupportive Organisationskultur, schwache Führungsunterstützung, begrenzte externe Policy-Rückhalt, Ressourcenmangel, misalignierte Communitynormen. Nachhaltige Skalierung erfordert Task-Sharing und Policy-Integration.</w:t>
       </w:r>
     </w:p>
     <w:p>
@@ -351,7 +351,7 @@
         <w:rPr>
           <w:sz w:val="19"/>
         </w:rPr>
-        <w:t>Spanien, Referenzmethode für europäische Surveillance</w:t>
+        <w:t>Äthiopien, Erwerbstätigengruppe; Arbeitsplatz-Modell ist auf deutsche Betriebliche Gesundheitsförderung übertragbar.</w:t>
       </w:r>
     </w:p>
     <w:p>
@@ -360,7 +360,7 @@
           <w:color w:val="5A7D3A"/>
           <w:sz w:val="18"/>
         </w:rPr>
-        <w:t>https://pubmed.ncbi.nlm.nih.gov/42904441/</w:t>
+        <w:t>https://pubmed.ncbi.nlm.nih.gov/42909154/</w:t>
       </w:r>
     </w:p>
     <w:p>
@@ -368,7 +368,7 @@
         <w:pStyle w:val="Heading2"/>
       </w:pPr>
       <w:r>
-        <w:t>Multipla Therapie bei HFpEF: GLP-1 bringt mehr Gewichtsverlust als Kaloriendefizit allein</w:t>
+        <w:t>Familie und Gemeinschaft verschärfen Stigma und psychische Belastung von übergewichtigen Mädchen</w:t>
       </w:r>
     </w:p>
     <w:p>
@@ -378,12 +378,12 @@
           <w:color w:val="666666"/>
           <w:sz w:val="18"/>
         </w:rPr>
-        <w:t>Prokopidis K et al.  ·  Curr Heart Fail Rep  ·  08.10.2026  ·  PMID 42848257</w:t>
+        <w:t>Bahathig A et al.  ·  Front Public Health  ·  07.10.2026  ·  PMID 42908972</w:t>
       </w:r>
     </w:p>
     <w:p>
       <w:r>
-        <w:t>Narrative Übersicht zu Lebensstil-, pharmakologischen und chirurgischen Interventionen zur Verbesserung von Muskelkraft, Körperkomposition und Funktionsfähigkeit bei HFpEF mit Sarkopenie und/oder Adipositas.</w:t>
+        <w:t>Qualitative Studie mit 30 weiblichen Jugendlichen (12-19 Jahre, 57% adipös, 43% übergewichtig); halbstrukturierte Interviews zu Familieneinflüssen, Kritik und psychischem Wohlbefinden.</w:t>
       </w:r>
     </w:p>
     <w:p>
@@ -394,7 +394,7 @@
         <w:t xml:space="preserve">Ergebnis: </w:t>
       </w:r>
       <w:r>
-        <w:t>Konkurrentes Ausdauer- und Krafttraining verbessert aerobe Kapazität, Funktionsleistung und Lebensqualität. GLP-1-Arzneimittel führen zu größerem Gewichtsverlust und funktionellen Verbesserungen als SGLT2i allein. Kombination aus Widerstandstraining und adäquater Proteinzufuhr konserviert Muskelmasse während Gewichtsverlust besser als Kalorienrestriktion.</w:t>
+        <w:t>Vier Themen identifiziert: (1) Essstörungszyklus aus Diäten und Überessen (n=16); (2) Kritik von Familie und Gemeinschaft (n=20); (3) psychologische Folgen wie niedriges Selbstwertgefühl, soziale Isolation (n=25), Sorgen um Kleidung und Ehe (n=22); (4) Bewältigungsstrategien. Negative Kommentare waren demotivierend, positive gesundheitsbezogene waren motivierend.</w:t>
       </w:r>
     </w:p>
     <w:p>
@@ -409,7 +409,7 @@
         <w:rPr>
           <w:sz w:val="19"/>
         </w:rPr>
-        <w:t>Deutschsprachige Autoren, UK, Skandinavien – Outcomes jenseits der Waage</w:t>
+        <w:t>Saudi-Arabien; Stigma-Dynamik in traditionellen Gesellschaften, aber psychische Belastung universell relevant.</w:t>
       </w:r>
     </w:p>
     <w:p>
@@ -418,7 +418,65 @@
           <w:color w:val="5A7D3A"/>
           <w:sz w:val="18"/>
         </w:rPr>
-        <w:t>https://pubmed.ncbi.nlm.nih.gov/42848257/</w:t>
+        <w:t>https://pubmed.ncbi.nlm.nih.gov/42908972/</w:t>
+      </w:r>
+    </w:p>
+    <w:p>
+      <w:pPr>
+        <w:pStyle w:val="Heading2"/>
+      </w:pPr>
+      <w:r>
+        <w:t>Fastintherapie senkt Blutdruck dysglykämischer Patienten unabhängig von Gewichtsverlust</w:t>
+      </w:r>
+    </w:p>
+    <w:p>
+      <w:r>
+        <w:rPr>
+          <w:i/>
+          <w:color w:val="666666"/>
+          <w:sz w:val="18"/>
+        </w:rPr>
+        <w:t>Ye Z et al.  ·  Front Endocrinol (Lausanne)  ·  07.10.2026  ·  PMID 42908842</w:t>
+      </w:r>
+    </w:p>
+    <w:p>
+      <w:r>
+        <w:t>Retrospektive Kohortenstudie (n=833 dysglykämische Erwachsene) zu modifiziertem Fasten; Blutdruck, Gewicht und Laborparameter vor/nach Intervention gemessen; lineare mixed models und Mediationsanalyse.</w:t>
+      </w:r>
+    </w:p>
+    <w:p>
+      <w:r>
+        <w:rPr>
+          <w:b/>
+        </w:rPr>
+        <w:t xml:space="preserve">Ergebnis: </w:t>
+      </w:r>
+      <w:r>
+        <w:t>Fasten senkte systolischen Blutdruck um 7,73 mmHg (95%-KI −8,64 bis −6,82) und diastolischen um 4,76 mmHg (95%-KI −5,39 bis −4,12), beide p&lt;0,001. Gewichtsverlust mediierte nicht signifikant die Blutdruckreduktion (indirekter Effekt SBP: −0,22, p=0,588). Effekt wurde modifiziert durch Alter, Geschlecht und Baseline-HbA1c; größere Reduktionen bei jüngeren, männlichen Patienten und höherem HbA1c.</w:t>
+      </w:r>
+    </w:p>
+    <w:p>
+      <w:r>
+        <w:rPr>
+          <w:b/>
+          <w:sz w:val="19"/>
+        </w:rPr>
+        <w:t xml:space="preserve">Übertragbarkeit: </w:t>
+      </w:r>
+      <w:r>
+        <w:rPr>
+          <w:sz w:val="19"/>
+        </w:rPr>
+        <w:t>China; Fasten-Effekt auf Blutdruck ist mechanistisch unabhängig vom Gewicht, Design auf deutsches Setting anwendbar.</w:t>
+      </w:r>
+    </w:p>
+    <w:p>
+      <w:r>
+        <w:rPr>
+          <w:color w:val="5A7D3A"/>
+          <w:sz w:val="18"/>
+        </w:rPr>
+        <w:t>https://pubmed.ncbi.nlm.nih.gov/42908842/</w:t>
       </w:r>
     </w:p>
     <w:sectPr>

</xml_diff>